<commit_message>
Fix typos and improve formatting in the final report and Jupyter notebook for the ATUS project
</commit_message>
<xml_diff>
--- a/E2_Analisis_Exploratorio_Preprocesamiento/E2_Analisis_Exploratorio_Preprocesamiento.docx
+++ b/E2_Analisis_Exploratorio_Preprocesamiento/E2_Analisis_Exploratorio_Preprocesamiento.docx
@@ -12,7 +12,7 @@
           <w:color w:val="182D43"/>
           <w:sz w:val="40"/>
         </w:rPr>
-        <w:t>E2 - Analisis exploratorio y preprocesamiento</w:t>
+        <w:t>E2 - Análisis exploratorio y preprocesamiento</w:t>
       </w:r>
     </w:p>
     <w:p>
@@ -33,12 +33,12 @@
         <w:pStyle w:val="Heading1"/>
       </w:pPr>
       <w:r>
-        <w:t>Proposito del entregable</w:t>
+        <w:t>Propósito del entregable</w:t>
       </w:r>
     </w:p>
     <w:p>
       <w:r>
-        <w:t>Este entregable documenta la carga, depuracion, preparacion y analisis exploratorio de los datos ATUS de Sonora. La version actual queda alineada con el cuaderno notebooks/atus_sonora_10_anios_prevencion.ipynb.</w:t>
+        <w:t>Este entregable documenta la carga, depuración, preparación y análisis exploratorio de los datos ATUS de Sonora. La versión actual queda alineada con el cuaderno notebooks/atus_sonora_10_anios_prevencion.ipynb.</w:t>
       </w:r>
     </w:p>
     <w:p>
@@ -377,7 +377,7 @@
         <w:pStyle w:val="Heading1"/>
       </w:pPr>
       <w:r>
-        <w:t>Limpieza y preparacion</w:t>
+        <w:t>Limpieza y preparación</w:t>
       </w:r>
     </w:p>
     <w:p>
@@ -409,7 +409,7 @@
         <w:pStyle w:val="ListBullet"/>
       </w:pPr>
       <w:r>
-        <w:t>Conversion de columnas numericas de heridos, fallecidos, vehiculos, hora, dia, mes y edad.</w:t>
+        <w:t>Conversion de columnas numericas de heridos, fallecidos, vehículos, hora, dia, mes y edad.</w:t>
       </w:r>
     </w:p>
     <w:p>
@@ -417,7 +417,7 @@
         <w:pStyle w:val="ListBullet"/>
       </w:pPr>
       <w:r>
-        <w:t>Union con el catalogo municipal para obtener nombres de municipios.</w:t>
+        <w:t>Union con el catálogo municipal para obtener nombres de municipios.</w:t>
       </w:r>
     </w:p>
     <w:p>
@@ -642,7 +642,7 @@
                 <w:b w:val="0"/>
                 <w:sz w:val="18"/>
               </w:rPr>
-              <w:t>1 si hubo victimas o si CLASACC indica Fatal/No fatal; 0 si solo danos.</w:t>
+              <w:t>1 si hubo víctimas o si CLASACC indica Fatal/No fatal; 0 si solo daños.</w:t>
             </w:r>
           </w:p>
         </w:tc>
@@ -676,7 +676,7 @@
                 <w:b w:val="0"/>
                 <w:sz w:val="18"/>
               </w:rPr>
-              <w:t>Fatal, Con heridos o Solo danos.</w:t>
+              <w:t>Fatal, Con heridos o Solo daños.</w:t>
             </w:r>
           </w:p>
         </w:tc>
@@ -710,7 +710,7 @@
                 <w:b w:val="0"/>
                 <w:sz w:val="18"/>
               </w:rPr>
-              <w:t>Madrugada, Manana, Tarde o Noche.</w:t>
+              <w:t>Madrugada, Mañana, Tarde o Noche.</w:t>
             </w:r>
           </w:p>
         </w:tc>
@@ -744,7 +744,7 @@
                 <w:b w:val="0"/>
                 <w:sz w:val="18"/>
               </w:rPr>
-              <w:t>Indica participacion de motocicleta o bicicleta.</w:t>
+              <w:t>Indica participación de motocicleta o bicicleta.</w:t>
             </w:r>
           </w:p>
         </w:tc>
@@ -772,7 +772,7 @@
         <w:pStyle w:val="ListBullet"/>
       </w:pPr>
       <w:r>
-        <w:t>Sur y Valle y Frontera tambien presentan alta concentracion de accidentes.</w:t>
+        <w:t>Sur y Valle y Frontera también presentan alta concentracion de accidentes.</w:t>
       </w:r>
     </w:p>
     <w:p>
@@ -780,7 +780,7 @@
         <w:pStyle w:val="ListBullet"/>
       </w:pPr>
       <w:r>
-        <w:t>Sierra presenta el porcentaje mas alto de accidentes graves con 24.25%.</w:t>
+        <w:t>Sierra presenta el porcentaje más alto de accidentes graves con 24.25%.</w:t>
       </w:r>
     </w:p>
     <w:p>
@@ -788,7 +788,7 @@
         <w:pStyle w:val="ListBullet"/>
       </w:pPr>
       <w:r>
-        <w:t>El tipo de accidente mas comun es la colision con vehiculo automotor.</w:t>
+        <w:t>El tipo de accidente más común es la colisión con vehículo automotor.</w:t>
       </w:r>
     </w:p>
     <w:p>
@@ -796,7 +796,7 @@
         <w:pStyle w:val="ListBullet"/>
       </w:pPr>
       <w:r>
-        <w:t>La causa probable mas frecuente es Conductor.</w:t>
+        <w:t>La causa probable más frecuente es Conductor.</w:t>
       </w:r>
     </w:p>
     <w:p>
@@ -804,7 +804,7 @@
         <w:pStyle w:val="ListBullet"/>
       </w:pPr>
       <w:r>
-        <w:t>Las tardes cercanas al fin de semana aparecen como franjas de interes preventivo; viernes por la tarde registra 10,802 accidentes.</w:t>
+        <w:t>Las tardes cercanas al fin de semana aparecen como franjas de interés preventivo; viernes por la tarde registra 10,802 accidentes.</w:t>
       </w:r>
     </w:p>
     <w:p>
@@ -817,7 +817,7 @@
     </w:p>
     <w:p>
       <w:r>
-        <w:t>El dataset queda listo para E3, donde se aplican clasificacion, reglas de asociacion y clustering jerarquico. El enfoque preventivo se conserva: no solo se describe el volumen de accidentes, sino tambien la gravedad y los contextos donde conviene focalizar acciones.</w:t>
+        <w:t>El dataset queda listo para E3, donde se aplican clasificación, reglas de asociación y clustering jerarquico. El enfoque preventivo se conserva: no solo se describe el volumen de accidentes, sino también la gravedad y los contextos donde conviene focalizar acciones.</w:t>
       </w:r>
     </w:p>
     <w:sectPr>

</xml_diff>